<commit_message>
Bug fixes and improvements
</commit_message>
<xml_diff>
--- a/Proje_Raporu.docx
+++ b/Proje_Raporu.docx
@@ -17,26 +17,64 @@
           <w:sz w:val="72"/>
           <w:szCs w:val="72"/>
         </w:rPr>
-        <w:t>Hotel &amp; Tour Reservation</w:t>
-      </w:r>
-    </w:p>
-    <w:p>
-      <w:pPr>
-        <w:jc w:val="center"/>
+        <w:t xml:space="preserve">Hotel &amp; </w:t>
+      </w:r>
+      <w:proofErr w:type="spellStart"/>
+      <w:r>
         <w:rPr>
           <w:color w:val="EE0000"/>
           <w:sz w:val="72"/>
           <w:szCs w:val="72"/>
         </w:rPr>
-      </w:pPr>
+        <w:t>Tour</w:t>
+      </w:r>
+      <w:proofErr w:type="spellEnd"/>
       <w:r>
         <w:rPr>
           <w:color w:val="EE0000"/>
           <w:sz w:val="72"/>
           <w:szCs w:val="72"/>
         </w:rPr>
-        <w:t>Management System</w:t>
-      </w:r>
+        <w:t xml:space="preserve"> </w:t>
+      </w:r>
+      <w:proofErr w:type="spellStart"/>
+      <w:r>
+        <w:rPr>
+          <w:color w:val="EE0000"/>
+          <w:sz w:val="72"/>
+          <w:szCs w:val="72"/>
+        </w:rPr>
+        <w:t>Reservation</w:t>
+      </w:r>
+      <w:proofErr w:type="spellEnd"/>
+    </w:p>
+    <w:p>
+      <w:pPr>
+        <w:jc w:val="center"/>
+        <w:rPr>
+          <w:color w:val="EE0000"/>
+          <w:sz w:val="72"/>
+          <w:szCs w:val="72"/>
+        </w:rPr>
+      </w:pPr>
+      <w:r>
+        <w:rPr>
+          <w:color w:val="EE0000"/>
+          <w:sz w:val="72"/>
+          <w:szCs w:val="72"/>
+        </w:rPr>
+        <w:t xml:space="preserve">Management </w:t>
+      </w:r>
+      <w:proofErr w:type="spellStart"/>
+      <w:r>
+        <w:rPr>
+          <w:color w:val="EE0000"/>
+          <w:sz w:val="72"/>
+          <w:szCs w:val="72"/>
+        </w:rPr>
+        <w:t>System</w:t>
+      </w:r>
+      <w:proofErr w:type="spellEnd"/>
     </w:p>
     <w:p>
       <w:pPr>
@@ -205,21 +243,69 @@
           <w:sz w:val="24"/>
           <w:szCs w:val="24"/>
         </w:rPr>
-        <w:t>Proje ASP.NET Core tabanlı web uygulaması olarak geliştirilmiş</w:t>
-      </w:r>
-      <w:r>
-        <w:rPr>
-          <w:sz w:val="24"/>
-          <w:szCs w:val="24"/>
-        </w:rPr>
-        <w:t xml:space="preserve"> Frontend için HTML, CSS ve JavaScript kullanılmıştır. V</w:t>
-      </w:r>
-      <w:r>
-        <w:rPr>
-          <w:sz w:val="24"/>
-          <w:szCs w:val="24"/>
-        </w:rPr>
-        <w:t>eritabanı yönetimi için Microsoft SQL</w:t>
+        <w:t xml:space="preserve">Proje ASP.NET </w:t>
+      </w:r>
+      <w:proofErr w:type="spellStart"/>
+      <w:r>
+        <w:rPr>
+          <w:sz w:val="24"/>
+          <w:szCs w:val="24"/>
+        </w:rPr>
+        <w:t>Core</w:t>
+      </w:r>
+      <w:proofErr w:type="spellEnd"/>
+      <w:r>
+        <w:rPr>
+          <w:sz w:val="24"/>
+          <w:szCs w:val="24"/>
+        </w:rPr>
+        <w:t xml:space="preserve"> tabanlı web uygulaması olarak geliştirilmiş</w:t>
+      </w:r>
+      <w:r>
+        <w:rPr>
+          <w:sz w:val="24"/>
+          <w:szCs w:val="24"/>
+        </w:rPr>
+        <w:t xml:space="preserve"> </w:t>
+      </w:r>
+      <w:proofErr w:type="spellStart"/>
+      <w:r>
+        <w:rPr>
+          <w:sz w:val="24"/>
+          <w:szCs w:val="24"/>
+        </w:rPr>
+        <w:t>Frontend</w:t>
+      </w:r>
+      <w:proofErr w:type="spellEnd"/>
+      <w:r>
+        <w:rPr>
+          <w:sz w:val="24"/>
+          <w:szCs w:val="24"/>
+        </w:rPr>
+        <w:t xml:space="preserve"> için HTML, CSS ve JavaScript kullanılmıştır. </w:t>
+      </w:r>
+      <w:proofErr w:type="spellStart"/>
+      <w:r>
+        <w:rPr>
+          <w:sz w:val="24"/>
+          <w:szCs w:val="24"/>
+        </w:rPr>
+        <w:t>V</w:t>
+      </w:r>
+      <w:r>
+        <w:rPr>
+          <w:sz w:val="24"/>
+          <w:szCs w:val="24"/>
+        </w:rPr>
+        <w:t>eritabanı</w:t>
+      </w:r>
+      <w:proofErr w:type="spellEnd"/>
+      <w:r>
+        <w:rPr>
+          <w:sz w:val="24"/>
+          <w:szCs w:val="24"/>
+        </w:rPr>
+        <w:t xml:space="preserve"> yönetimi için Microsoft SQL</w:t>
       </w:r>
       <w:r>
         <w:rPr>
@@ -642,7 +728,25 @@
           <w:szCs w:val="28"/>
         </w:rPr>
         <w:lastRenderedPageBreak/>
-        <w:t>3. Veritabanında Kullanılan Tablolar ve Açıklamaları:</w:t>
+        <w:t xml:space="preserve">3. </w:t>
+      </w:r>
+      <w:proofErr w:type="spellStart"/>
+      <w:r>
+        <w:rPr>
+          <w:color w:val="0070C0"/>
+          <w:sz w:val="28"/>
+          <w:szCs w:val="28"/>
+        </w:rPr>
+        <w:t>Veritabanında</w:t>
+      </w:r>
+      <w:proofErr w:type="spellEnd"/>
+      <w:r>
+        <w:rPr>
+          <w:color w:val="0070C0"/>
+          <w:sz w:val="28"/>
+          <w:szCs w:val="28"/>
+        </w:rPr>
+        <w:t xml:space="preserve"> Kullanılan Tablolar ve Açıklamaları:</w:t>
       </w:r>
     </w:p>
     <w:p>
@@ -668,6 +772,7 @@
           <w:szCs w:val="24"/>
         </w:rPr>
       </w:pPr>
+      <w:proofErr w:type="spellStart"/>
       <w:r>
         <w:rPr>
           <w:b/>
@@ -677,6 +782,7 @@
         </w:rPr>
         <w:t>Hotels</w:t>
       </w:r>
+      <w:proofErr w:type="spellEnd"/>
     </w:p>
     <w:p>
       <w:pPr>
@@ -707,6 +813,7 @@
           <w:szCs w:val="24"/>
         </w:rPr>
       </w:pPr>
+      <w:proofErr w:type="spellStart"/>
       <w:r>
         <w:rPr>
           <w:b/>
@@ -716,6 +823,7 @@
         </w:rPr>
         <w:t>Rooms</w:t>
       </w:r>
+      <w:proofErr w:type="spellEnd"/>
     </w:p>
     <w:p>
       <w:pPr>
@@ -746,6 +854,7 @@
           <w:szCs w:val="24"/>
         </w:rPr>
       </w:pPr>
+      <w:proofErr w:type="spellStart"/>
       <w:r>
         <w:rPr>
           <w:b/>
@@ -755,20 +864,53 @@
         </w:rPr>
         <w:t>RoomTypes</w:t>
       </w:r>
-    </w:p>
-    <w:p>
-      <w:pPr>
-        <w:rPr>
-          <w:sz w:val="24"/>
-          <w:szCs w:val="24"/>
-        </w:rPr>
-      </w:pPr>
-      <w:r>
-        <w:rPr>
-          <w:sz w:val="24"/>
-          <w:szCs w:val="24"/>
-        </w:rPr>
-        <w:t>Oda tiplerini (Single, Double, Suite vb.) saklayan referans tablosudur.</w:t>
+      <w:proofErr w:type="spellEnd"/>
+    </w:p>
+    <w:p>
+      <w:pPr>
+        <w:rPr>
+          <w:sz w:val="24"/>
+          <w:szCs w:val="24"/>
+        </w:rPr>
+      </w:pPr>
+      <w:r>
+        <w:rPr>
+          <w:sz w:val="24"/>
+          <w:szCs w:val="24"/>
+        </w:rPr>
+        <w:t>Oda tiplerini (</w:t>
+      </w:r>
+      <w:proofErr w:type="spellStart"/>
+      <w:r>
+        <w:rPr>
+          <w:sz w:val="24"/>
+          <w:szCs w:val="24"/>
+        </w:rPr>
+        <w:t>Single</w:t>
+      </w:r>
+      <w:proofErr w:type="spellEnd"/>
+      <w:r>
+        <w:rPr>
+          <w:sz w:val="24"/>
+          <w:szCs w:val="24"/>
+        </w:rPr>
+        <w:t xml:space="preserve">, </w:t>
+      </w:r>
+      <w:proofErr w:type="spellStart"/>
+      <w:r>
+        <w:rPr>
+          <w:sz w:val="24"/>
+          <w:szCs w:val="24"/>
+        </w:rPr>
+        <w:t>Double</w:t>
+      </w:r>
+      <w:proofErr w:type="spellEnd"/>
+      <w:r>
+        <w:rPr>
+          <w:sz w:val="24"/>
+          <w:szCs w:val="24"/>
+        </w:rPr>
+        <w:t>, Suite vb.) saklayan referans tablosudur.</w:t>
       </w:r>
     </w:p>
     <w:p>
@@ -785,6 +927,7 @@
           <w:szCs w:val="24"/>
         </w:rPr>
       </w:pPr>
+      <w:proofErr w:type="spellStart"/>
       <w:r>
         <w:rPr>
           <w:b/>
@@ -794,6 +937,7 @@
         </w:rPr>
         <w:t>HotelImages</w:t>
       </w:r>
+      <w:proofErr w:type="spellEnd"/>
     </w:p>
     <w:p>
       <w:pPr>
@@ -824,6 +968,7 @@
           <w:szCs w:val="24"/>
         </w:rPr>
       </w:pPr>
+      <w:proofErr w:type="spellStart"/>
       <w:r>
         <w:rPr>
           <w:b/>
@@ -833,20 +978,51 @@
         </w:rPr>
         <w:t>HotelAmenities</w:t>
       </w:r>
-    </w:p>
-    <w:p>
-      <w:pPr>
-        <w:rPr>
-          <w:sz w:val="24"/>
-          <w:szCs w:val="24"/>
-        </w:rPr>
-      </w:pPr>
-      <w:r>
-        <w:rPr>
-          <w:sz w:val="24"/>
-          <w:szCs w:val="24"/>
-        </w:rPr>
-        <w:t>Otellerin sunduğu özellikleri (Wi-Fi, SPA, Otapark vb.) temsil eder.</w:t>
+      <w:proofErr w:type="spellEnd"/>
+    </w:p>
+    <w:p>
+      <w:pPr>
+        <w:rPr>
+          <w:sz w:val="24"/>
+          <w:szCs w:val="24"/>
+        </w:rPr>
+      </w:pPr>
+      <w:r>
+        <w:rPr>
+          <w:sz w:val="24"/>
+          <w:szCs w:val="24"/>
+        </w:rPr>
+        <w:t>Otellerin sunduğu özellikleri (</w:t>
+      </w:r>
+      <w:proofErr w:type="spellStart"/>
+      <w:r>
+        <w:rPr>
+          <w:sz w:val="24"/>
+          <w:szCs w:val="24"/>
+        </w:rPr>
+        <w:t>Wi</w:t>
+      </w:r>
+      <w:proofErr w:type="spellEnd"/>
+      <w:r>
+        <w:rPr>
+          <w:sz w:val="24"/>
+          <w:szCs w:val="24"/>
+        </w:rPr>
+        <w:t xml:space="preserve">-Fi, SPA, </w:t>
+      </w:r>
+      <w:r>
+        <w:rPr>
+          <w:sz w:val="24"/>
+          <w:szCs w:val="24"/>
+        </w:rPr>
+        <w:t>Otopark</w:t>
+      </w:r>
+      <w:r>
+        <w:rPr>
+          <w:sz w:val="24"/>
+          <w:szCs w:val="24"/>
+        </w:rPr>
+        <w:t xml:space="preserve"> vb.) temsil eder.</w:t>
       </w:r>
     </w:p>
     <w:p>
@@ -863,6 +1039,7 @@
           <w:szCs w:val="24"/>
         </w:rPr>
       </w:pPr>
+      <w:proofErr w:type="spellStart"/>
       <w:r>
         <w:rPr>
           <w:b/>
@@ -872,6 +1049,7 @@
         </w:rPr>
         <w:t>RoomAmenities</w:t>
       </w:r>
+      <w:proofErr w:type="spellEnd"/>
     </w:p>
     <w:p>
       <w:pPr>
@@ -902,6 +1080,7 @@
           <w:szCs w:val="24"/>
         </w:rPr>
       </w:pPr>
+      <w:proofErr w:type="spellStart"/>
       <w:r>
         <w:rPr>
           <w:b/>
@@ -911,6 +1090,7 @@
         </w:rPr>
         <w:t>Reservations</w:t>
       </w:r>
+      <w:proofErr w:type="spellEnd"/>
     </w:p>
     <w:p>
       <w:pPr>
@@ -941,6 +1121,7 @@
           <w:szCs w:val="24"/>
         </w:rPr>
       </w:pPr>
+      <w:proofErr w:type="spellStart"/>
       <w:r>
         <w:rPr>
           <w:b/>
@@ -950,6 +1131,7 @@
         </w:rPr>
         <w:t>HotelReviews</w:t>
       </w:r>
+      <w:proofErr w:type="spellEnd"/>
     </w:p>
     <w:p>
       <w:pPr>
@@ -980,6 +1162,7 @@
           <w:szCs w:val="24"/>
         </w:rPr>
       </w:pPr>
+      <w:proofErr w:type="spellStart"/>
       <w:r>
         <w:rPr>
           <w:b/>
@@ -989,6 +1172,7 @@
         </w:rPr>
         <w:t>ReviewReplies</w:t>
       </w:r>
+      <w:proofErr w:type="spellEnd"/>
     </w:p>
     <w:p>
       <w:pPr>
@@ -1019,6 +1203,7 @@
           <w:szCs w:val="24"/>
         </w:rPr>
       </w:pPr>
+      <w:proofErr w:type="spellStart"/>
       <w:r>
         <w:rPr>
           <w:b/>
@@ -1028,6 +1213,7 @@
         </w:rPr>
         <w:t>Tour</w:t>
       </w:r>
+      <w:proofErr w:type="spellEnd"/>
     </w:p>
     <w:p>
       <w:pPr>
@@ -1058,6 +1244,7 @@
           <w:szCs w:val="24"/>
         </w:rPr>
       </w:pPr>
+      <w:proofErr w:type="spellStart"/>
       <w:r>
         <w:rPr>
           <w:b/>
@@ -1067,6 +1254,7 @@
         </w:rPr>
         <w:t>TourDateTimes</w:t>
       </w:r>
+      <w:proofErr w:type="spellEnd"/>
     </w:p>
     <w:p>
       <w:pPr>
@@ -1097,6 +1285,7 @@
           <w:szCs w:val="24"/>
         </w:rPr>
       </w:pPr>
+      <w:proofErr w:type="spellStart"/>
       <w:r>
         <w:rPr>
           <w:b/>
@@ -1106,6 +1295,7 @@
         </w:rPr>
         <w:t>TourBookings</w:t>
       </w:r>
+      <w:proofErr w:type="spellEnd"/>
     </w:p>
     <w:p>
       <w:pPr>
@@ -1147,6 +1337,7 @@
           <w:szCs w:val="24"/>
         </w:rPr>
       </w:pPr>
+      <w:proofErr w:type="spellStart"/>
       <w:r>
         <w:rPr>
           <w:b/>
@@ -1156,6 +1347,7 @@
         </w:rPr>
         <w:t>TourReviews</w:t>
       </w:r>
+      <w:proofErr w:type="spellEnd"/>
     </w:p>
     <w:p>
       <w:pPr>
@@ -1186,6 +1378,7 @@
           <w:szCs w:val="24"/>
         </w:rPr>
       </w:pPr>
+      <w:proofErr w:type="spellStart"/>
       <w:r>
         <w:rPr>
           <w:b/>
@@ -1195,20 +1388,53 @@
         </w:rPr>
         <w:t>Users</w:t>
       </w:r>
-    </w:p>
-    <w:p>
-      <w:pPr>
-        <w:rPr>
-          <w:sz w:val="24"/>
-          <w:szCs w:val="24"/>
-        </w:rPr>
-      </w:pPr>
-      <w:r>
-        <w:rPr>
-          <w:sz w:val="24"/>
-          <w:szCs w:val="24"/>
-        </w:rPr>
-        <w:t>Sistem kullanıcılarını (müşteriler, yöneticiler, admin) tutar. Email, şifre, ad-soyad gibi temel bilgiler burada depolanır.</w:t>
+      <w:proofErr w:type="spellEnd"/>
+    </w:p>
+    <w:p>
+      <w:pPr>
+        <w:rPr>
+          <w:sz w:val="24"/>
+          <w:szCs w:val="24"/>
+        </w:rPr>
+      </w:pPr>
+      <w:r>
+        <w:rPr>
+          <w:sz w:val="24"/>
+          <w:szCs w:val="24"/>
+        </w:rPr>
+        <w:t xml:space="preserve">Sistem kullanıcılarını (müşteriler, yöneticiler, admin) tutar. </w:t>
+      </w:r>
+      <w:proofErr w:type="spellStart"/>
+      <w:r>
+        <w:rPr>
+          <w:sz w:val="24"/>
+          <w:szCs w:val="24"/>
+        </w:rPr>
+        <w:t>Email</w:t>
+      </w:r>
+      <w:proofErr w:type="spellEnd"/>
+      <w:r>
+        <w:rPr>
+          <w:sz w:val="24"/>
+          <w:szCs w:val="24"/>
+        </w:rPr>
+        <w:t>, şifre, ad-</w:t>
+      </w:r>
+      <w:proofErr w:type="spellStart"/>
+      <w:r>
+        <w:rPr>
+          <w:sz w:val="24"/>
+          <w:szCs w:val="24"/>
+        </w:rPr>
+        <w:t>soyad</w:t>
+      </w:r>
+      <w:proofErr w:type="spellEnd"/>
+      <w:r>
+        <w:rPr>
+          <w:sz w:val="24"/>
+          <w:szCs w:val="24"/>
+        </w:rPr>
+        <w:t xml:space="preserve"> gibi temel bilgiler burada depolanır.</w:t>
       </w:r>
     </w:p>
     <w:p>
@@ -1225,6 +1451,7 @@
           <w:szCs w:val="24"/>
         </w:rPr>
       </w:pPr>
+      <w:proofErr w:type="spellStart"/>
       <w:r>
         <w:rPr>
           <w:b/>
@@ -1234,6 +1461,7 @@
         </w:rPr>
         <w:t>ManagerApplications</w:t>
       </w:r>
+      <w:proofErr w:type="spellEnd"/>
     </w:p>
     <w:p>
       <w:pPr>
@@ -1264,6 +1492,7 @@
           <w:szCs w:val="24"/>
         </w:rPr>
       </w:pPr>
+      <w:proofErr w:type="spellStart"/>
       <w:r>
         <w:rPr>
           <w:b/>
@@ -1273,20 +1502,37 @@
         </w:rPr>
         <w:t>HotelStatusHistory</w:t>
       </w:r>
-    </w:p>
-    <w:p>
-      <w:pPr>
-        <w:rPr>
-          <w:sz w:val="24"/>
-          <w:szCs w:val="24"/>
-        </w:rPr>
-      </w:pPr>
-      <w:r>
-        <w:rPr>
-          <w:sz w:val="24"/>
-          <w:szCs w:val="24"/>
-        </w:rPr>
-        <w:t>Otel durum değişikliklerinin geçmişini tutarak audit (kayıt izleme) işlevi sağlar.</w:t>
+      <w:proofErr w:type="spellEnd"/>
+    </w:p>
+    <w:p>
+      <w:pPr>
+        <w:rPr>
+          <w:sz w:val="24"/>
+          <w:szCs w:val="24"/>
+        </w:rPr>
+      </w:pPr>
+      <w:r>
+        <w:rPr>
+          <w:sz w:val="24"/>
+          <w:szCs w:val="24"/>
+        </w:rPr>
+        <w:t xml:space="preserve">Otel durum değişikliklerinin geçmişini tutarak </w:t>
+      </w:r>
+      <w:proofErr w:type="spellStart"/>
+      <w:r>
+        <w:rPr>
+          <w:sz w:val="24"/>
+          <w:szCs w:val="24"/>
+        </w:rPr>
+        <w:t>audit</w:t>
+      </w:r>
+      <w:proofErr w:type="spellEnd"/>
+      <w:r>
+        <w:rPr>
+          <w:sz w:val="24"/>
+          <w:szCs w:val="24"/>
+        </w:rPr>
+        <w:t xml:space="preserve"> (kayıt izleme) işlevi sağlar.</w:t>
       </w:r>
     </w:p>
     <w:p>
@@ -1303,6 +1549,7 @@
           <w:szCs w:val="24"/>
         </w:rPr>
       </w:pPr>
+      <w:proofErr w:type="spellStart"/>
       <w:r>
         <w:rPr>
           <w:b/>
@@ -1312,6 +1559,7 @@
         </w:rPr>
         <w:t>ReservationAudit</w:t>
       </w:r>
+      <w:proofErr w:type="spellEnd"/>
     </w:p>
     <w:p>
       <w:pPr>
@@ -1358,7 +1606,25 @@
           <w:sz w:val="28"/>
           <w:szCs w:val="28"/>
         </w:rPr>
-        <w:t>Stored Procedure (SP) Listesi ve Görevleri:</w:t>
+        <w:t xml:space="preserve">Stored </w:t>
+      </w:r>
+      <w:proofErr w:type="spellStart"/>
+      <w:r>
+        <w:rPr>
+          <w:color w:val="0070C0"/>
+          <w:sz w:val="28"/>
+          <w:szCs w:val="28"/>
+        </w:rPr>
+        <w:t>Procedure</w:t>
+      </w:r>
+      <w:proofErr w:type="spellEnd"/>
+      <w:r>
+        <w:rPr>
+          <w:color w:val="0070C0"/>
+          <w:sz w:val="28"/>
+          <w:szCs w:val="28"/>
+        </w:rPr>
+        <w:t xml:space="preserve"> (SP) Listesi ve Görevleri:</w:t>
       </w:r>
     </w:p>
     <w:p>
@@ -1382,6 +1648,7 @@
           <w:szCs w:val="24"/>
         </w:rPr>
       </w:pPr>
+      <w:proofErr w:type="spellStart"/>
       <w:r>
         <w:rPr>
           <w:sz w:val="24"/>
@@ -1389,6 +1656,7 @@
         </w:rPr>
         <w:t>sp_SearchAvailableRooms</w:t>
       </w:r>
+      <w:proofErr w:type="spellEnd"/>
     </w:p>
     <w:p>
       <w:pPr>
@@ -1517,14 +1785,55 @@
           <w:sz w:val="24"/>
           <w:szCs w:val="24"/>
         </w:rPr>
-        <w:t>/Pages/</w:t>
-      </w:r>
-      <w:r>
-        <w:rPr>
-          <w:sz w:val="24"/>
-          <w:szCs w:val="24"/>
-        </w:rPr>
-        <w:t>Search/Index.cshtml.cs — Müşteri arama ekranı</w:t>
+        <w:t>/</w:t>
+      </w:r>
+      <w:proofErr w:type="spellStart"/>
+      <w:r>
+        <w:rPr>
+          <w:sz w:val="24"/>
+          <w:szCs w:val="24"/>
+        </w:rPr>
+        <w:t>Pages</w:t>
+      </w:r>
+      <w:proofErr w:type="spellEnd"/>
+      <w:r>
+        <w:rPr>
+          <w:sz w:val="24"/>
+          <w:szCs w:val="24"/>
+        </w:rPr>
+        <w:t>/</w:t>
+      </w:r>
+      <w:proofErr w:type="spellStart"/>
+      <w:r>
+        <w:rPr>
+          <w:sz w:val="24"/>
+          <w:szCs w:val="24"/>
+        </w:rPr>
+        <w:t>Search</w:t>
+      </w:r>
+      <w:proofErr w:type="spellEnd"/>
+      <w:r>
+        <w:rPr>
+          <w:sz w:val="24"/>
+          <w:szCs w:val="24"/>
+        </w:rPr>
+        <w:t>/</w:t>
+      </w:r>
+      <w:proofErr w:type="spellStart"/>
+      <w:r>
+        <w:rPr>
+          <w:sz w:val="24"/>
+          <w:szCs w:val="24"/>
+        </w:rPr>
+        <w:t>Index.cshtml.cs</w:t>
+      </w:r>
+      <w:proofErr w:type="spellEnd"/>
+      <w:r>
+        <w:rPr>
+          <w:sz w:val="24"/>
+          <w:szCs w:val="24"/>
+        </w:rPr>
+        <w:t xml:space="preserve"> — Müşteri arama ekranı</w:t>
       </w:r>
     </w:p>
     <w:p>
@@ -1556,6 +1865,7 @@
           <w:szCs w:val="24"/>
         </w:rPr>
       </w:pPr>
+      <w:proofErr w:type="spellStart"/>
       <w:r>
         <w:rPr>
           <w:sz w:val="24"/>
@@ -1563,6 +1873,7 @@
         </w:rPr>
         <w:t>sp_CreateReservation</w:t>
       </w:r>
+      <w:proofErr w:type="spellEnd"/>
     </w:p>
     <w:p>
       <w:pPr>
@@ -1631,6 +1942,7 @@
         <w:br/>
         <w:t xml:space="preserve">Bu SP </w:t>
       </w:r>
+      <w:proofErr w:type="spellStart"/>
       <w:r>
         <w:rPr>
           <w:b/>
@@ -1640,6 +1952,7 @@
         </w:rPr>
         <w:t>fn_GetNightCount</w:t>
       </w:r>
+      <w:proofErr w:type="spellEnd"/>
       <w:r>
         <w:rPr>
           <w:sz w:val="24"/>
@@ -1677,14 +1990,55 @@
           <w:sz w:val="24"/>
           <w:szCs w:val="24"/>
         </w:rPr>
-        <w:t>/Pages/</w:t>
-      </w:r>
-      <w:r>
-        <w:rPr>
-          <w:sz w:val="24"/>
-          <w:szCs w:val="24"/>
-        </w:rPr>
-        <w:t xml:space="preserve">Reservations/Create.cshtml.cs </w:t>
+        <w:t>/</w:t>
+      </w:r>
+      <w:proofErr w:type="spellStart"/>
+      <w:r>
+        <w:rPr>
+          <w:sz w:val="24"/>
+          <w:szCs w:val="24"/>
+        </w:rPr>
+        <w:t>Pages</w:t>
+      </w:r>
+      <w:proofErr w:type="spellEnd"/>
+      <w:r>
+        <w:rPr>
+          <w:sz w:val="24"/>
+          <w:szCs w:val="24"/>
+        </w:rPr>
+        <w:t>/</w:t>
+      </w:r>
+      <w:proofErr w:type="spellStart"/>
+      <w:r>
+        <w:rPr>
+          <w:sz w:val="24"/>
+          <w:szCs w:val="24"/>
+        </w:rPr>
+        <w:t>Reservations</w:t>
+      </w:r>
+      <w:proofErr w:type="spellEnd"/>
+      <w:r>
+        <w:rPr>
+          <w:sz w:val="24"/>
+          <w:szCs w:val="24"/>
+        </w:rPr>
+        <w:t>/</w:t>
+      </w:r>
+      <w:proofErr w:type="spellStart"/>
+      <w:r>
+        <w:rPr>
+          <w:sz w:val="24"/>
+          <w:szCs w:val="24"/>
+        </w:rPr>
+        <w:t>Create.cshtml.cs</w:t>
+      </w:r>
+      <w:proofErr w:type="spellEnd"/>
+      <w:r>
+        <w:rPr>
+          <w:sz w:val="24"/>
+          <w:szCs w:val="24"/>
+        </w:rPr>
+        <w:t xml:space="preserve"> </w:t>
       </w:r>
     </w:p>
     <w:p>
@@ -1716,6 +2070,7 @@
           <w:szCs w:val="24"/>
         </w:rPr>
       </w:pPr>
+      <w:proofErr w:type="spellStart"/>
       <w:r>
         <w:rPr>
           <w:sz w:val="24"/>
@@ -1723,6 +2078,7 @@
         </w:rPr>
         <w:t>sp_GetCustomerReservations</w:t>
       </w:r>
+      <w:proofErr w:type="spellEnd"/>
     </w:p>
     <w:p>
       <w:pPr>
@@ -1777,15 +2133,49 @@
           <w:sz w:val="24"/>
           <w:szCs w:val="24"/>
         </w:rPr>
-        <w:t>/Pages/</w:t>
-      </w:r>
-      <w:r>
-        <w:rPr>
-          <w:sz w:val="24"/>
-          <w:szCs w:val="24"/>
-        </w:rPr>
-        <w:t>Customer/MyReservations.cshtml.cs</w:t>
-      </w:r>
+        <w:t>/</w:t>
+      </w:r>
+      <w:proofErr w:type="spellStart"/>
+      <w:r>
+        <w:rPr>
+          <w:sz w:val="24"/>
+          <w:szCs w:val="24"/>
+        </w:rPr>
+        <w:t>Pages</w:t>
+      </w:r>
+      <w:proofErr w:type="spellEnd"/>
+      <w:r>
+        <w:rPr>
+          <w:sz w:val="24"/>
+          <w:szCs w:val="24"/>
+        </w:rPr>
+        <w:t>/</w:t>
+      </w:r>
+      <w:proofErr w:type="spellStart"/>
+      <w:r>
+        <w:rPr>
+          <w:sz w:val="24"/>
+          <w:szCs w:val="24"/>
+        </w:rPr>
+        <w:t>Customer</w:t>
+      </w:r>
+      <w:proofErr w:type="spellEnd"/>
+      <w:r>
+        <w:rPr>
+          <w:sz w:val="24"/>
+          <w:szCs w:val="24"/>
+        </w:rPr>
+        <w:t>/</w:t>
+      </w:r>
+      <w:proofErr w:type="spellStart"/>
+      <w:r>
+        <w:rPr>
+          <w:sz w:val="24"/>
+          <w:szCs w:val="24"/>
+        </w:rPr>
+        <w:t>MyReservations.cshtml.cs</w:t>
+      </w:r>
+      <w:proofErr w:type="spellEnd"/>
     </w:p>
     <w:p>
       <w:pPr>
@@ -1816,6 +2206,7 @@
           <w:szCs w:val="24"/>
         </w:rPr>
       </w:pPr>
+      <w:proofErr w:type="spellStart"/>
       <w:r>
         <w:rPr>
           <w:sz w:val="24"/>
@@ -1823,6 +2214,7 @@
         </w:rPr>
         <w:t>sp_GetHotelStats</w:t>
       </w:r>
+      <w:proofErr w:type="spellEnd"/>
     </w:p>
     <w:p>
       <w:pPr>
@@ -1953,7 +2345,23 @@
           <w:sz w:val="24"/>
           <w:szCs w:val="24"/>
         </w:rPr>
-        <w:t>/Pages/</w:t>
+        <w:t>/</w:t>
+      </w:r>
+      <w:proofErr w:type="spellStart"/>
+      <w:r>
+        <w:rPr>
+          <w:sz w:val="24"/>
+          <w:szCs w:val="24"/>
+        </w:rPr>
+        <w:t>Pages</w:t>
+      </w:r>
+      <w:proofErr w:type="spellEnd"/>
+      <w:r>
+        <w:rPr>
+          <w:sz w:val="24"/>
+          <w:szCs w:val="24"/>
+        </w:rPr>
+        <w:t>/</w:t>
       </w:r>
       <w:r>
         <w:rPr>
@@ -1969,6 +2377,7 @@
         </w:rPr>
         <w:t>/</w:t>
       </w:r>
+      <w:proofErr w:type="spellStart"/>
       <w:r>
         <w:rPr>
           <w:sz w:val="24"/>
@@ -1976,6 +2385,7 @@
         </w:rPr>
         <w:t>Hotels</w:t>
       </w:r>
+      <w:proofErr w:type="spellEnd"/>
       <w:r>
         <w:rPr>
           <w:sz w:val="24"/>
@@ -1983,6 +2393,7 @@
         </w:rPr>
         <w:t>/</w:t>
       </w:r>
+      <w:proofErr w:type="spellStart"/>
       <w:r>
         <w:rPr>
           <w:sz w:val="24"/>
@@ -1990,6 +2401,7 @@
         </w:rPr>
         <w:t>Details.cshtml.cs</w:t>
       </w:r>
+      <w:proofErr w:type="spellEnd"/>
     </w:p>
     <w:p>
       <w:pPr>
@@ -2020,6 +2432,7 @@
           <w:szCs w:val="24"/>
         </w:rPr>
       </w:pPr>
+      <w:proofErr w:type="spellStart"/>
       <w:r>
         <w:rPr>
           <w:sz w:val="24"/>
@@ -2027,6 +2440,7 @@
         </w:rPr>
         <w:t>sp_ApproveHotel</w:t>
       </w:r>
+      <w:proofErr w:type="spellEnd"/>
     </w:p>
     <w:p>
       <w:pPr>
@@ -2077,15 +2491,37 @@
         <w:br/>
         <w:t xml:space="preserve">Bu SP tetiklenince </w:t>
       </w:r>
-      <w:r>
-        <w:rPr>
-          <w:b/>
-          <w:bCs/>
-          <w:sz w:val="24"/>
-          <w:szCs w:val="24"/>
-        </w:rPr>
-        <w:t>HotelStatusHistory Trigger’ı</w:t>
-      </w:r>
+      <w:proofErr w:type="spellStart"/>
+      <w:r>
+        <w:rPr>
+          <w:b/>
+          <w:bCs/>
+          <w:sz w:val="24"/>
+          <w:szCs w:val="24"/>
+        </w:rPr>
+        <w:t>HotelStatusHistory</w:t>
+      </w:r>
+      <w:proofErr w:type="spellEnd"/>
+      <w:r>
+        <w:rPr>
+          <w:b/>
+          <w:bCs/>
+          <w:sz w:val="24"/>
+          <w:szCs w:val="24"/>
+        </w:rPr>
+        <w:t xml:space="preserve"> </w:t>
+      </w:r>
+      <w:proofErr w:type="spellStart"/>
+      <w:r>
+        <w:rPr>
+          <w:b/>
+          <w:bCs/>
+          <w:sz w:val="24"/>
+          <w:szCs w:val="24"/>
+        </w:rPr>
+        <w:t>Trigger’ı</w:t>
+      </w:r>
+      <w:proofErr w:type="spellEnd"/>
       <w:r>
         <w:rPr>
           <w:sz w:val="24"/>
@@ -2122,7 +2558,23 @@
           <w:sz w:val="24"/>
           <w:szCs w:val="24"/>
         </w:rPr>
-        <w:t>/Pages/</w:t>
+        <w:t>/</w:t>
+      </w:r>
+      <w:proofErr w:type="spellStart"/>
+      <w:r>
+        <w:rPr>
+          <w:sz w:val="24"/>
+          <w:szCs w:val="24"/>
+        </w:rPr>
+        <w:t>Pages</w:t>
+      </w:r>
+      <w:proofErr w:type="spellEnd"/>
+      <w:r>
+        <w:rPr>
+          <w:sz w:val="24"/>
+          <w:szCs w:val="24"/>
+        </w:rPr>
+        <w:t>/</w:t>
       </w:r>
       <w:r>
         <w:rPr>
@@ -2138,6 +2590,7 @@
         </w:rPr>
         <w:t>/</w:t>
       </w:r>
+      <w:proofErr w:type="spellStart"/>
       <w:r>
         <w:rPr>
           <w:sz w:val="24"/>
@@ -2145,6 +2598,7 @@
         </w:rPr>
         <w:t>Hotels</w:t>
       </w:r>
+      <w:proofErr w:type="spellEnd"/>
       <w:r>
         <w:rPr>
           <w:sz w:val="24"/>
@@ -2152,6 +2606,7 @@
         </w:rPr>
         <w:t>/</w:t>
       </w:r>
+      <w:proofErr w:type="spellStart"/>
       <w:r>
         <w:rPr>
           <w:sz w:val="24"/>
@@ -2159,6 +2614,7 @@
         </w:rPr>
         <w:t>Details</w:t>
       </w:r>
+      <w:proofErr w:type="spellEnd"/>
     </w:p>
     <w:p>
       <w:pPr>
@@ -2190,7 +2646,25 @@
           <w:sz w:val="28"/>
           <w:szCs w:val="28"/>
         </w:rPr>
-        <w:t>. Trigger Listesi ve Görevleri:</w:t>
+        <w:t xml:space="preserve">. </w:t>
+      </w:r>
+      <w:proofErr w:type="spellStart"/>
+      <w:r>
+        <w:rPr>
+          <w:color w:val="0070C0"/>
+          <w:sz w:val="28"/>
+          <w:szCs w:val="28"/>
+        </w:rPr>
+        <w:t>Trigger</w:t>
+      </w:r>
+      <w:proofErr w:type="spellEnd"/>
+      <w:r>
+        <w:rPr>
+          <w:color w:val="0070C0"/>
+          <w:sz w:val="28"/>
+          <w:szCs w:val="28"/>
+        </w:rPr>
+        <w:t xml:space="preserve"> Listesi ve Görevleri:</w:t>
       </w:r>
     </w:p>
     <w:p>
@@ -2213,6 +2687,7 @@
           <w:szCs w:val="24"/>
         </w:rPr>
       </w:pPr>
+      <w:proofErr w:type="spellStart"/>
       <w:r>
         <w:rPr>
           <w:b/>
@@ -2222,6 +2697,7 @@
         </w:rPr>
         <w:t>trg_Reservations_Insert_Audit</w:t>
       </w:r>
+      <w:proofErr w:type="spellEnd"/>
     </w:p>
     <w:p>
       <w:pPr>
@@ -2267,7 +2743,23 @@
           <w:sz w:val="24"/>
           <w:szCs w:val="24"/>
         </w:rPr>
-        <w:t xml:space="preserve"> Yeni rezervasyon eklenince audit tablosuna log ekler.</w:t>
+        <w:t xml:space="preserve"> Yeni rezervasyon eklenince </w:t>
+      </w:r>
+      <w:proofErr w:type="spellStart"/>
+      <w:r>
+        <w:rPr>
+          <w:sz w:val="24"/>
+          <w:szCs w:val="24"/>
+        </w:rPr>
+        <w:t>audit</w:t>
+      </w:r>
+      <w:proofErr w:type="spellEnd"/>
+      <w:r>
+        <w:rPr>
+          <w:sz w:val="24"/>
+          <w:szCs w:val="24"/>
+        </w:rPr>
+        <w:t xml:space="preserve"> tablosuna log ekler.</w:t>
       </w:r>
     </w:p>
     <w:p>
@@ -2299,6 +2791,7 @@
           <w:szCs w:val="24"/>
         </w:rPr>
       </w:pPr>
+      <w:proofErr w:type="spellStart"/>
       <w:r>
         <w:rPr>
           <w:sz w:val="24"/>
@@ -2306,6 +2799,7 @@
         </w:rPr>
         <w:t>ReservationId</w:t>
       </w:r>
+      <w:proofErr w:type="spellEnd"/>
     </w:p>
     <w:p>
       <w:pPr>
@@ -2318,12 +2812,21 @@
           <w:szCs w:val="24"/>
         </w:rPr>
       </w:pPr>
-      <w:r>
-        <w:rPr>
-          <w:sz w:val="24"/>
-          <w:szCs w:val="24"/>
-        </w:rPr>
-        <w:t>Operation = INSERT</w:t>
+      <w:proofErr w:type="spellStart"/>
+      <w:r>
+        <w:rPr>
+          <w:sz w:val="24"/>
+          <w:szCs w:val="24"/>
+        </w:rPr>
+        <w:t>Operation</w:t>
+      </w:r>
+      <w:proofErr w:type="spellEnd"/>
+      <w:r>
+        <w:rPr>
+          <w:sz w:val="24"/>
+          <w:szCs w:val="24"/>
+        </w:rPr>
+        <w:t xml:space="preserve"> = INSERT</w:t>
       </w:r>
     </w:p>
     <w:p>
@@ -2337,12 +2840,37 @@
           <w:szCs w:val="24"/>
         </w:rPr>
       </w:pPr>
-      <w:r>
-        <w:rPr>
-          <w:sz w:val="24"/>
-          <w:szCs w:val="24"/>
-        </w:rPr>
-        <w:t>NewStatus (Pending)</w:t>
+      <w:proofErr w:type="spellStart"/>
+      <w:r>
+        <w:rPr>
+          <w:sz w:val="24"/>
+          <w:szCs w:val="24"/>
+        </w:rPr>
+        <w:t>NewStatus</w:t>
+      </w:r>
+      <w:proofErr w:type="spellEnd"/>
+      <w:r>
+        <w:rPr>
+          <w:sz w:val="24"/>
+          <w:szCs w:val="24"/>
+        </w:rPr>
+        <w:t xml:space="preserve"> (</w:t>
+      </w:r>
+      <w:proofErr w:type="spellStart"/>
+      <w:r>
+        <w:rPr>
+          <w:sz w:val="24"/>
+          <w:szCs w:val="24"/>
+        </w:rPr>
+        <w:t>Pending</w:t>
+      </w:r>
+      <w:proofErr w:type="spellEnd"/>
+      <w:r>
+        <w:rPr>
+          <w:sz w:val="24"/>
+          <w:szCs w:val="24"/>
+        </w:rPr>
+        <w:t>)</w:t>
       </w:r>
     </w:p>
     <w:p>
@@ -2376,6 +2904,7 @@
           <w:szCs w:val="24"/>
         </w:rPr>
       </w:pPr>
+      <w:proofErr w:type="spellStart"/>
       <w:r>
         <w:rPr>
           <w:b/>
@@ -2385,6 +2914,7 @@
         </w:rPr>
         <w:t>trg_Reservations_Update_Audit</w:t>
       </w:r>
+      <w:proofErr w:type="spellEnd"/>
     </w:p>
     <w:p>
       <w:pPr>
@@ -2464,6 +2994,7 @@
           <w:szCs w:val="24"/>
         </w:rPr>
       </w:pPr>
+      <w:proofErr w:type="spellStart"/>
       <w:r>
         <w:rPr>
           <w:b/>
@@ -2473,6 +3004,7 @@
         </w:rPr>
         <w:t>trg_Reservations_Delete_Audit</w:t>
       </w:r>
+      <w:proofErr w:type="spellEnd"/>
     </w:p>
     <w:p>
       <w:pPr>
@@ -2518,7 +3050,23 @@
           <w:sz w:val="24"/>
           <w:szCs w:val="24"/>
         </w:rPr>
-        <w:t xml:space="preserve"> Silinen rezervasyon bilgilerini audit tablosuna yazar.</w:t>
+        <w:t xml:space="preserve"> Silinen rezervasyon bilgilerini </w:t>
+      </w:r>
+      <w:proofErr w:type="spellStart"/>
+      <w:r>
+        <w:rPr>
+          <w:sz w:val="24"/>
+          <w:szCs w:val="24"/>
+        </w:rPr>
+        <w:t>audit</w:t>
+      </w:r>
+      <w:proofErr w:type="spellEnd"/>
+      <w:r>
+        <w:rPr>
+          <w:sz w:val="24"/>
+          <w:szCs w:val="24"/>
+        </w:rPr>
+        <w:t xml:space="preserve"> tablosuna yazar.</w:t>
       </w:r>
     </w:p>
     <w:p>
@@ -2552,6 +3100,7 @@
           <w:szCs w:val="24"/>
         </w:rPr>
       </w:pPr>
+      <w:proofErr w:type="spellStart"/>
       <w:r>
         <w:rPr>
           <w:b/>
@@ -2561,6 +3110,7 @@
         </w:rPr>
         <w:t>trg_Hotels_StatusHistory</w:t>
       </w:r>
+      <w:proofErr w:type="spellEnd"/>
     </w:p>
     <w:p>
       <w:pPr>
@@ -2613,7 +3163,55 @@
           <w:sz w:val="24"/>
           <w:szCs w:val="24"/>
         </w:rPr>
-        <w:t>Otelin IsApproved veya IsActive alanı değiştiğinde history tablosuna kayıt ekler.</w:t>
+        <w:t xml:space="preserve">Otelin </w:t>
+      </w:r>
+      <w:proofErr w:type="spellStart"/>
+      <w:r>
+        <w:rPr>
+          <w:sz w:val="24"/>
+          <w:szCs w:val="24"/>
+        </w:rPr>
+        <w:t>IsApproved</w:t>
+      </w:r>
+      <w:proofErr w:type="spellEnd"/>
+      <w:r>
+        <w:rPr>
+          <w:sz w:val="24"/>
+          <w:szCs w:val="24"/>
+        </w:rPr>
+        <w:t xml:space="preserve"> veya </w:t>
+      </w:r>
+      <w:proofErr w:type="spellStart"/>
+      <w:r>
+        <w:rPr>
+          <w:sz w:val="24"/>
+          <w:szCs w:val="24"/>
+        </w:rPr>
+        <w:t>IsActive</w:t>
+      </w:r>
+      <w:proofErr w:type="spellEnd"/>
+      <w:r>
+        <w:rPr>
+          <w:sz w:val="24"/>
+          <w:szCs w:val="24"/>
+        </w:rPr>
+        <w:t xml:space="preserve"> alanı değiştiğinde </w:t>
+      </w:r>
+      <w:proofErr w:type="spellStart"/>
+      <w:r>
+        <w:rPr>
+          <w:sz w:val="24"/>
+          <w:szCs w:val="24"/>
+        </w:rPr>
+        <w:t>history</w:t>
+      </w:r>
+      <w:proofErr w:type="spellEnd"/>
+      <w:r>
+        <w:rPr>
+          <w:sz w:val="24"/>
+          <w:szCs w:val="24"/>
+        </w:rPr>
+        <w:t xml:space="preserve"> tablosuna kayıt ekler.</w:t>
       </w:r>
     </w:p>
     <w:p>
@@ -2705,8 +3303,19 @@
           <w:sz w:val="24"/>
           <w:szCs w:val="24"/>
         </w:rPr>
-        <w:t>5.1. fn_GetNightCount</w:t>
-      </w:r>
+        <w:t xml:space="preserve">5.1. </w:t>
+      </w:r>
+      <w:proofErr w:type="spellStart"/>
+      <w:r>
+        <w:rPr>
+          <w:b/>
+          <w:bCs/>
+          <w:sz w:val="24"/>
+          <w:szCs w:val="24"/>
+        </w:rPr>
+        <w:t>fn_GetNightCount</w:t>
+      </w:r>
+      <w:proofErr w:type="spellEnd"/>
     </w:p>
     <w:p>
       <w:pPr>
@@ -2730,7 +3339,38 @@
           <w:szCs w:val="24"/>
         </w:rPr>
         <w:br/>
-        <w:t>CheckIn – CheckOut tarihleri arasındaki gece sayısını hesaplar.</w:t>
+      </w:r>
+      <w:proofErr w:type="spellStart"/>
+      <w:r>
+        <w:rPr>
+          <w:sz w:val="24"/>
+          <w:szCs w:val="24"/>
+        </w:rPr>
+        <w:t>CheckIn</w:t>
+      </w:r>
+      <w:proofErr w:type="spellEnd"/>
+      <w:r>
+        <w:rPr>
+          <w:sz w:val="24"/>
+          <w:szCs w:val="24"/>
+        </w:rPr>
+        <w:t xml:space="preserve"> – </w:t>
+      </w:r>
+      <w:proofErr w:type="spellStart"/>
+      <w:r>
+        <w:rPr>
+          <w:sz w:val="24"/>
+          <w:szCs w:val="24"/>
+        </w:rPr>
+        <w:t>CheckOut</w:t>
+      </w:r>
+      <w:proofErr w:type="spellEnd"/>
+      <w:r>
+        <w:rPr>
+          <w:sz w:val="24"/>
+          <w:szCs w:val="24"/>
+        </w:rPr>
+        <w:t xml:space="preserve"> tarihleri arasındaki gece sayısını hesaplar.</w:t>
       </w:r>
     </w:p>
     <w:p>
@@ -2755,7 +3395,22 @@
           <w:szCs w:val="24"/>
         </w:rPr>
         <w:br/>
-        <w:t>sp_CreateReservation içinde → toplam fiyat hesaplaması.</w:t>
+      </w:r>
+      <w:proofErr w:type="spellStart"/>
+      <w:r>
+        <w:rPr>
+          <w:sz w:val="24"/>
+          <w:szCs w:val="24"/>
+        </w:rPr>
+        <w:t>sp_CreateReservation</w:t>
+      </w:r>
+      <w:proofErr w:type="spellEnd"/>
+      <w:r>
+        <w:rPr>
+          <w:sz w:val="24"/>
+          <w:szCs w:val="24"/>
+        </w:rPr>
+        <w:t xml:space="preserve"> içinde → toplam fiyat hesaplaması.</w:t>
       </w:r>
     </w:p>
     <w:p>
@@ -2791,8 +3446,19 @@
           <w:sz w:val="24"/>
           <w:szCs w:val="24"/>
         </w:rPr>
-        <w:t>5.2. fn_GetReservationTotalPrice</w:t>
-      </w:r>
+        <w:t xml:space="preserve">5.2. </w:t>
+      </w:r>
+      <w:proofErr w:type="spellStart"/>
+      <w:r>
+        <w:rPr>
+          <w:b/>
+          <w:bCs/>
+          <w:sz w:val="24"/>
+          <w:szCs w:val="24"/>
+        </w:rPr>
+        <w:t>fn_GetReservationTotalPrice</w:t>
+      </w:r>
+      <w:proofErr w:type="spellEnd"/>
     </w:p>
     <w:p>
       <w:pPr>
@@ -2816,7 +3482,23 @@
           <w:szCs w:val="24"/>
         </w:rPr>
         <w:br/>
-        <w:t>Verilen rezervasyon Id’nin toplam fiyatını döndürür.</w:t>
+        <w:t xml:space="preserve">Verilen rezervasyon </w:t>
+      </w:r>
+      <w:proofErr w:type="spellStart"/>
+      <w:r>
+        <w:rPr>
+          <w:sz w:val="24"/>
+          <w:szCs w:val="24"/>
+        </w:rPr>
+        <w:t>Id’nin</w:t>
+      </w:r>
+      <w:proofErr w:type="spellEnd"/>
+      <w:r>
+        <w:rPr>
+          <w:sz w:val="24"/>
+          <w:szCs w:val="24"/>
+        </w:rPr>
+        <w:t xml:space="preserve"> toplam fiyatını döndürür.</w:t>
       </w:r>
     </w:p>
     <w:p>
@@ -2850,8 +3532,19 @@
           <w:sz w:val="24"/>
           <w:szCs w:val="24"/>
         </w:rPr>
-        <w:t>5.3. fn_GetHotelAverageRating</w:t>
-      </w:r>
+        <w:t xml:space="preserve">5.3. </w:t>
+      </w:r>
+      <w:proofErr w:type="spellStart"/>
+      <w:r>
+        <w:rPr>
+          <w:b/>
+          <w:bCs/>
+          <w:sz w:val="24"/>
+          <w:szCs w:val="24"/>
+        </w:rPr>
+        <w:t>fn_GetHotelAverageRating</w:t>
+      </w:r>
+      <w:proofErr w:type="spellEnd"/>
     </w:p>
     <w:p>
       <w:pPr>
@@ -2900,15 +3593,33 @@
           <w:szCs w:val="28"/>
         </w:rPr>
         <w:lastRenderedPageBreak/>
-        <w:t>7. V</w:t>
-      </w:r>
+        <w:t xml:space="preserve">7. </w:t>
+      </w:r>
+      <w:proofErr w:type="spellStart"/>
       <w:r>
         <w:rPr>
           <w:color w:val="0070C0"/>
           <w:sz w:val="28"/>
           <w:szCs w:val="28"/>
         </w:rPr>
-        <w:t>iew ve Görevi:</w:t>
+        <w:t>V</w:t>
+      </w:r>
+      <w:r>
+        <w:rPr>
+          <w:color w:val="0070C0"/>
+          <w:sz w:val="28"/>
+          <w:szCs w:val="28"/>
+        </w:rPr>
+        <w:t>iew</w:t>
+      </w:r>
+      <w:proofErr w:type="spellEnd"/>
+      <w:r>
+        <w:rPr>
+          <w:color w:val="0070C0"/>
+          <w:sz w:val="28"/>
+          <w:szCs w:val="28"/>
+        </w:rPr>
+        <w:t xml:space="preserve"> ve Görevi:</w:t>
       </w:r>
     </w:p>
     <w:p>
@@ -3100,7 +3811,23 @@
           <w:sz w:val="24"/>
           <w:szCs w:val="24"/>
         </w:rPr>
-        <w:t>/Pages/</w:t>
+        <w:t>/</w:t>
+      </w:r>
+      <w:proofErr w:type="spellStart"/>
+      <w:r>
+        <w:rPr>
+          <w:sz w:val="24"/>
+          <w:szCs w:val="24"/>
+        </w:rPr>
+        <w:t>Pages</w:t>
+      </w:r>
+      <w:proofErr w:type="spellEnd"/>
+      <w:r>
+        <w:rPr>
+          <w:sz w:val="24"/>
+          <w:szCs w:val="24"/>
+        </w:rPr>
+        <w:t>/</w:t>
       </w:r>
       <w:r>
         <w:rPr>
@@ -3116,6 +3843,7 @@
         </w:rPr>
         <w:t>/</w:t>
       </w:r>
+      <w:proofErr w:type="spellStart"/>
       <w:r>
         <w:rPr>
           <w:sz w:val="24"/>
@@ -3123,6 +3851,7 @@
         </w:rPr>
         <w:t>Hotels</w:t>
       </w:r>
+      <w:proofErr w:type="spellEnd"/>
       <w:r>
         <w:rPr>
           <w:sz w:val="24"/>
@@ -3130,6 +3859,7 @@
         </w:rPr>
         <w:t>/</w:t>
       </w:r>
+      <w:proofErr w:type="spellStart"/>
       <w:r>
         <w:rPr>
           <w:sz w:val="24"/>
@@ -3137,6 +3867,7 @@
         </w:rPr>
         <w:t>Index.cshtml.cs</w:t>
       </w:r>
+      <w:proofErr w:type="spellEnd"/>
     </w:p>
     <w:p>
       <w:pPr>
@@ -3175,29 +3906,237 @@
           <w:sz w:val="28"/>
           <w:szCs w:val="28"/>
         </w:rPr>
-        <w:t>iyagramı Özeti:</w:t>
-      </w:r>
-    </w:p>
-    <w:p>
-      <w:pPr>
-        <w:rPr>
-          <w:sz w:val="24"/>
-          <w:szCs w:val="24"/>
-        </w:rPr>
-      </w:pPr>
-    </w:p>
-    <w:p>
-      <w:pPr>
-        <w:rPr>
-          <w:sz w:val="24"/>
-          <w:szCs w:val="24"/>
-        </w:rPr>
-      </w:pPr>
-      <w:r>
-        <w:rPr>
-          <w:sz w:val="24"/>
-          <w:szCs w:val="24"/>
-        </w:rPr>
+        <w:t xml:space="preserve">iyagramı </w:t>
+      </w:r>
+      <w:r>
+        <w:rPr>
+          <w:color w:val="0070C0"/>
+          <w:sz w:val="28"/>
+          <w:szCs w:val="28"/>
+        </w:rPr>
+        <w:t xml:space="preserve">ve </w:t>
+      </w:r>
+      <w:r>
+        <w:rPr>
+          <w:color w:val="0070C0"/>
+          <w:sz w:val="28"/>
+          <w:szCs w:val="28"/>
+        </w:rPr>
+        <w:t>Özeti:</w:t>
+      </w:r>
+    </w:p>
+    <w:p>
+      <w:pPr>
+        <w:rPr>
+          <w:color w:val="0070C0"/>
+          <w:sz w:val="28"/>
+          <w:szCs w:val="28"/>
+        </w:rPr>
+      </w:pPr>
+      <w:r>
+        <w:rPr>
+          <w:noProof/>
+          <w:color w:val="0070C0"/>
+          <w:sz w:val="28"/>
+          <w:szCs w:val="28"/>
+        </w:rPr>
+        <w:drawing>
+          <wp:anchor distT="0" distB="0" distL="114300" distR="114300" simplePos="0" relativeHeight="251658240" behindDoc="0" locked="0" layoutInCell="1" allowOverlap="1" wp14:anchorId="438518E5" wp14:editId="02B7A254">
+            <wp:simplePos x="0" y="0"/>
+            <wp:positionH relativeFrom="column">
+              <wp:posOffset>-699770</wp:posOffset>
+            </wp:positionH>
+            <wp:positionV relativeFrom="paragraph">
+              <wp:posOffset>137160</wp:posOffset>
+            </wp:positionV>
+            <wp:extent cx="7072928" cy="3981450"/>
+            <wp:effectExtent l="0" t="0" r="0" b="0"/>
+            <wp:wrapNone/>
+            <wp:docPr id="1887100606" name="Resim 1"/>
+            <wp:cNvGraphicFramePr>
+              <a:graphicFrameLocks xmlns:a="http://schemas.openxmlformats.org/drawingml/2006/main" noChangeAspect="1"/>
+            </wp:cNvGraphicFramePr>
+            <a:graphic xmlns:a="http://schemas.openxmlformats.org/drawingml/2006/main">
+              <a:graphicData uri="http://schemas.openxmlformats.org/drawingml/2006/picture">
+                <pic:pic xmlns:pic="http://schemas.openxmlformats.org/drawingml/2006/picture">
+                  <pic:nvPicPr>
+                    <pic:cNvPr id="0" name="Picture 10"/>
+                    <pic:cNvPicPr>
+                      <a:picLocks noChangeAspect="1" noChangeArrowheads="1"/>
+                    </pic:cNvPicPr>
+                  </pic:nvPicPr>
+                  <pic:blipFill>
+                    <a:blip r:embed="rId5" cstate="print">
+                      <a:extLst>
+                        <a:ext uri="{28A0092B-C50C-407E-A947-70E740481C1C}">
+                          <a14:useLocalDpi xmlns:a14="http://schemas.microsoft.com/office/drawing/2010/main" val="0"/>
+                        </a:ext>
+                      </a:extLst>
+                    </a:blip>
+                    <a:srcRect/>
+                    <a:stretch>
+                      <a:fillRect/>
+                    </a:stretch>
+                  </pic:blipFill>
+                  <pic:spPr bwMode="auto">
+                    <a:xfrm>
+                      <a:off x="0" y="0"/>
+                      <a:ext cx="7077286" cy="3983903"/>
+                    </a:xfrm>
+                    <a:prstGeom prst="rect">
+                      <a:avLst/>
+                    </a:prstGeom>
+                    <a:noFill/>
+                    <a:ln>
+                      <a:noFill/>
+                    </a:ln>
+                  </pic:spPr>
+                </pic:pic>
+              </a:graphicData>
+            </a:graphic>
+            <wp14:sizeRelH relativeFrom="page">
+              <wp14:pctWidth>0</wp14:pctWidth>
+            </wp14:sizeRelH>
+            <wp14:sizeRelV relativeFrom="page">
+              <wp14:pctHeight>0</wp14:pctHeight>
+            </wp14:sizeRelV>
+          </wp:anchor>
+        </w:drawing>
+      </w:r>
+    </w:p>
+    <w:p>
+      <w:pPr>
+        <w:rPr>
+          <w:sz w:val="24"/>
+          <w:szCs w:val="24"/>
+        </w:rPr>
+      </w:pPr>
+    </w:p>
+    <w:p>
+      <w:pPr>
+        <w:rPr>
+          <w:sz w:val="24"/>
+          <w:szCs w:val="24"/>
+        </w:rPr>
+      </w:pPr>
+    </w:p>
+    <w:p>
+      <w:pPr>
+        <w:rPr>
+          <w:sz w:val="24"/>
+          <w:szCs w:val="24"/>
+        </w:rPr>
+      </w:pPr>
+    </w:p>
+    <w:p>
+      <w:pPr>
+        <w:rPr>
+          <w:sz w:val="24"/>
+          <w:szCs w:val="24"/>
+        </w:rPr>
+      </w:pPr>
+    </w:p>
+    <w:p>
+      <w:pPr>
+        <w:rPr>
+          <w:sz w:val="24"/>
+          <w:szCs w:val="24"/>
+        </w:rPr>
+      </w:pPr>
+    </w:p>
+    <w:p>
+      <w:pPr>
+        <w:rPr>
+          <w:sz w:val="24"/>
+          <w:szCs w:val="24"/>
+        </w:rPr>
+      </w:pPr>
+    </w:p>
+    <w:p>
+      <w:pPr>
+        <w:rPr>
+          <w:sz w:val="24"/>
+          <w:szCs w:val="24"/>
+        </w:rPr>
+      </w:pPr>
+    </w:p>
+    <w:p>
+      <w:pPr>
+        <w:rPr>
+          <w:sz w:val="24"/>
+          <w:szCs w:val="24"/>
+        </w:rPr>
+      </w:pPr>
+    </w:p>
+    <w:p>
+      <w:pPr>
+        <w:rPr>
+          <w:sz w:val="24"/>
+          <w:szCs w:val="24"/>
+        </w:rPr>
+      </w:pPr>
+    </w:p>
+    <w:p>
+      <w:pPr>
+        <w:rPr>
+          <w:sz w:val="24"/>
+          <w:szCs w:val="24"/>
+        </w:rPr>
+      </w:pPr>
+    </w:p>
+    <w:p>
+      <w:pPr>
+        <w:rPr>
+          <w:sz w:val="24"/>
+          <w:szCs w:val="24"/>
+        </w:rPr>
+      </w:pPr>
+    </w:p>
+    <w:p>
+      <w:pPr>
+        <w:rPr>
+          <w:sz w:val="24"/>
+          <w:szCs w:val="24"/>
+        </w:rPr>
+      </w:pPr>
+    </w:p>
+    <w:p>
+      <w:pPr>
+        <w:rPr>
+          <w:sz w:val="24"/>
+          <w:szCs w:val="24"/>
+        </w:rPr>
+      </w:pPr>
+    </w:p>
+    <w:p>
+      <w:pPr>
+        <w:rPr>
+          <w:sz w:val="24"/>
+          <w:szCs w:val="24"/>
+        </w:rPr>
+      </w:pPr>
+    </w:p>
+    <w:p>
+      <w:pPr>
+        <w:rPr>
+          <w:sz w:val="24"/>
+          <w:szCs w:val="24"/>
+        </w:rPr>
+      </w:pPr>
+    </w:p>
+    <w:p>
+      <w:pPr>
+        <w:rPr>
+          <w:sz w:val="24"/>
+          <w:szCs w:val="24"/>
+        </w:rPr>
+      </w:pPr>
+      <w:r>
+        <w:rPr>
+          <w:sz w:val="24"/>
+          <w:szCs w:val="24"/>
+        </w:rPr>
+        <w:lastRenderedPageBreak/>
         <w:t>ER diyagramında ana ilişkiler:</w:t>
       </w:r>
     </w:p>
@@ -3212,14 +4151,45 @@
           <w:szCs w:val="24"/>
         </w:rPr>
       </w:pPr>
-      <w:r>
-        <w:rPr>
-          <w:b/>
-          <w:bCs/>
-          <w:sz w:val="24"/>
-          <w:szCs w:val="24"/>
-        </w:rPr>
-        <w:t>AppUser – Hotels:</w:t>
+      <w:proofErr w:type="spellStart"/>
+      <w:r>
+        <w:rPr>
+          <w:b/>
+          <w:bCs/>
+          <w:sz w:val="24"/>
+          <w:szCs w:val="24"/>
+        </w:rPr>
+        <w:t>AppUser</w:t>
+      </w:r>
+      <w:proofErr w:type="spellEnd"/>
+      <w:r>
+        <w:rPr>
+          <w:b/>
+          <w:bCs/>
+          <w:sz w:val="24"/>
+          <w:szCs w:val="24"/>
+        </w:rPr>
+        <w:t xml:space="preserve"> – </w:t>
+      </w:r>
+      <w:proofErr w:type="spellStart"/>
+      <w:r>
+        <w:rPr>
+          <w:b/>
+          <w:bCs/>
+          <w:sz w:val="24"/>
+          <w:szCs w:val="24"/>
+        </w:rPr>
+        <w:t>Hotels</w:t>
+      </w:r>
+      <w:proofErr w:type="spellEnd"/>
+      <w:r>
+        <w:rPr>
+          <w:b/>
+          <w:bCs/>
+          <w:sz w:val="24"/>
+          <w:szCs w:val="24"/>
+        </w:rPr>
+        <w:t>:</w:t>
       </w:r>
       <w:r>
         <w:rPr>
@@ -3227,7 +4197,23 @@
           <w:szCs w:val="24"/>
         </w:rPr>
         <w:br/>
-        <w:t>Bir kullanıcı (manager) birden çok otel yönetebilir.</w:t>
+        <w:t>Bir kullanıcı (</w:t>
+      </w:r>
+      <w:proofErr w:type="spellStart"/>
+      <w:r>
+        <w:rPr>
+          <w:sz w:val="24"/>
+          <w:szCs w:val="24"/>
+        </w:rPr>
+        <w:t>manager</w:t>
+      </w:r>
+      <w:proofErr w:type="spellEnd"/>
+      <w:r>
+        <w:rPr>
+          <w:sz w:val="24"/>
+          <w:szCs w:val="24"/>
+        </w:rPr>
+        <w:t>) birden çok otel yönetebilir.</w:t>
       </w:r>
     </w:p>
     <w:p>
@@ -3248,7 +4234,27 @@
           <w:sz w:val="24"/>
           <w:szCs w:val="24"/>
         </w:rPr>
-        <w:t>Hotel – Rooms:</w:t>
+        <w:t xml:space="preserve">Hotel – </w:t>
+      </w:r>
+      <w:proofErr w:type="spellStart"/>
+      <w:r>
+        <w:rPr>
+          <w:b/>
+          <w:bCs/>
+          <w:sz w:val="24"/>
+          <w:szCs w:val="24"/>
+        </w:rPr>
+        <w:t>Rooms</w:t>
+      </w:r>
+      <w:proofErr w:type="spellEnd"/>
+      <w:r>
+        <w:rPr>
+          <w:b/>
+          <w:bCs/>
+          <w:sz w:val="24"/>
+          <w:szCs w:val="24"/>
+        </w:rPr>
+        <w:t>:</w:t>
       </w:r>
       <w:r>
         <w:rPr>
@@ -3270,14 +4276,45 @@
           <w:szCs w:val="24"/>
         </w:rPr>
       </w:pPr>
-      <w:r>
-        <w:rPr>
-          <w:b/>
-          <w:bCs/>
-          <w:sz w:val="24"/>
-          <w:szCs w:val="24"/>
-        </w:rPr>
-        <w:t>Room – Reservations:</w:t>
+      <w:proofErr w:type="spellStart"/>
+      <w:r>
+        <w:rPr>
+          <w:b/>
+          <w:bCs/>
+          <w:sz w:val="24"/>
+          <w:szCs w:val="24"/>
+        </w:rPr>
+        <w:t>Room</w:t>
+      </w:r>
+      <w:proofErr w:type="spellEnd"/>
+      <w:r>
+        <w:rPr>
+          <w:b/>
+          <w:bCs/>
+          <w:sz w:val="24"/>
+          <w:szCs w:val="24"/>
+        </w:rPr>
+        <w:t xml:space="preserve"> – </w:t>
+      </w:r>
+      <w:proofErr w:type="spellStart"/>
+      <w:r>
+        <w:rPr>
+          <w:b/>
+          <w:bCs/>
+          <w:sz w:val="24"/>
+          <w:szCs w:val="24"/>
+        </w:rPr>
+        <w:t>Reservations</w:t>
+      </w:r>
+      <w:proofErr w:type="spellEnd"/>
+      <w:r>
+        <w:rPr>
+          <w:b/>
+          <w:bCs/>
+          <w:sz w:val="24"/>
+          <w:szCs w:val="24"/>
+        </w:rPr>
+        <w:t>:</w:t>
       </w:r>
       <w:r>
         <w:rPr>
@@ -3299,14 +4336,45 @@
           <w:szCs w:val="24"/>
         </w:rPr>
       </w:pPr>
-      <w:r>
-        <w:rPr>
-          <w:b/>
-          <w:bCs/>
-          <w:sz w:val="24"/>
-          <w:szCs w:val="24"/>
-        </w:rPr>
-        <w:t>AppUser – Reservations:</w:t>
+      <w:proofErr w:type="spellStart"/>
+      <w:r>
+        <w:rPr>
+          <w:b/>
+          <w:bCs/>
+          <w:sz w:val="24"/>
+          <w:szCs w:val="24"/>
+        </w:rPr>
+        <w:t>AppUser</w:t>
+      </w:r>
+      <w:proofErr w:type="spellEnd"/>
+      <w:r>
+        <w:rPr>
+          <w:b/>
+          <w:bCs/>
+          <w:sz w:val="24"/>
+          <w:szCs w:val="24"/>
+        </w:rPr>
+        <w:t xml:space="preserve"> – </w:t>
+      </w:r>
+      <w:proofErr w:type="spellStart"/>
+      <w:r>
+        <w:rPr>
+          <w:b/>
+          <w:bCs/>
+          <w:sz w:val="24"/>
+          <w:szCs w:val="24"/>
+        </w:rPr>
+        <w:t>Reservations</w:t>
+      </w:r>
+      <w:proofErr w:type="spellEnd"/>
+      <w:r>
+        <w:rPr>
+          <w:b/>
+          <w:bCs/>
+          <w:sz w:val="24"/>
+          <w:szCs w:val="24"/>
+        </w:rPr>
+        <w:t>:</w:t>
       </w:r>
       <w:r>
         <w:rPr>
@@ -3335,7 +4403,27 @@
           <w:sz w:val="24"/>
           <w:szCs w:val="24"/>
         </w:rPr>
-        <w:t>Hotel – HotelReviews:</w:t>
+        <w:t xml:space="preserve">Hotel – </w:t>
+      </w:r>
+      <w:proofErr w:type="spellStart"/>
+      <w:r>
+        <w:rPr>
+          <w:b/>
+          <w:bCs/>
+          <w:sz w:val="24"/>
+          <w:szCs w:val="24"/>
+        </w:rPr>
+        <w:t>HotelReviews</w:t>
+      </w:r>
+      <w:proofErr w:type="spellEnd"/>
+      <w:r>
+        <w:rPr>
+          <w:b/>
+          <w:bCs/>
+          <w:sz w:val="24"/>
+          <w:szCs w:val="24"/>
+        </w:rPr>
+        <w:t>:</w:t>
       </w:r>
       <w:r>
         <w:rPr>
@@ -3364,7 +4452,27 @@
           <w:sz w:val="24"/>
           <w:szCs w:val="24"/>
         </w:rPr>
-        <w:t>Hotel – HotelImages:</w:t>
+        <w:t xml:space="preserve">Hotel – </w:t>
+      </w:r>
+      <w:proofErr w:type="spellStart"/>
+      <w:r>
+        <w:rPr>
+          <w:b/>
+          <w:bCs/>
+          <w:sz w:val="24"/>
+          <w:szCs w:val="24"/>
+        </w:rPr>
+        <w:t>HotelImages</w:t>
+      </w:r>
+      <w:proofErr w:type="spellEnd"/>
+      <w:r>
+        <w:rPr>
+          <w:b/>
+          <w:bCs/>
+          <w:sz w:val="24"/>
+          <w:szCs w:val="24"/>
+        </w:rPr>
+        <w:t>:</w:t>
       </w:r>
       <w:r>
         <w:rPr>
@@ -3386,14 +4494,45 @@
           <w:szCs w:val="24"/>
         </w:rPr>
       </w:pPr>
-      <w:r>
-        <w:rPr>
-          <w:b/>
-          <w:bCs/>
-          <w:sz w:val="24"/>
-          <w:szCs w:val="24"/>
-        </w:rPr>
-        <w:t>Reservations ↔ ReservationAudit:</w:t>
+      <w:proofErr w:type="spellStart"/>
+      <w:r>
+        <w:rPr>
+          <w:b/>
+          <w:bCs/>
+          <w:sz w:val="24"/>
+          <w:szCs w:val="24"/>
+        </w:rPr>
+        <w:t>Reservations</w:t>
+      </w:r>
+      <w:proofErr w:type="spellEnd"/>
+      <w:r>
+        <w:rPr>
+          <w:b/>
+          <w:bCs/>
+          <w:sz w:val="24"/>
+          <w:szCs w:val="24"/>
+        </w:rPr>
+        <w:t xml:space="preserve"> ↔ </w:t>
+      </w:r>
+      <w:proofErr w:type="spellStart"/>
+      <w:r>
+        <w:rPr>
+          <w:b/>
+          <w:bCs/>
+          <w:sz w:val="24"/>
+          <w:szCs w:val="24"/>
+        </w:rPr>
+        <w:t>ReservationAudit</w:t>
+      </w:r>
+      <w:proofErr w:type="spellEnd"/>
+      <w:r>
+        <w:rPr>
+          <w:b/>
+          <w:bCs/>
+          <w:sz w:val="24"/>
+          <w:szCs w:val="24"/>
+        </w:rPr>
+        <w:t>:</w:t>
       </w:r>
       <w:r>
         <w:rPr>
@@ -3415,14 +4554,45 @@
           <w:szCs w:val="24"/>
         </w:rPr>
       </w:pPr>
-      <w:r>
-        <w:rPr>
-          <w:b/>
-          <w:bCs/>
-          <w:sz w:val="24"/>
-          <w:szCs w:val="24"/>
-        </w:rPr>
-        <w:t>Hotels ↔ HotelStatusHistory:</w:t>
+      <w:proofErr w:type="spellStart"/>
+      <w:r>
+        <w:rPr>
+          <w:b/>
+          <w:bCs/>
+          <w:sz w:val="24"/>
+          <w:szCs w:val="24"/>
+        </w:rPr>
+        <w:t>Hotels</w:t>
+      </w:r>
+      <w:proofErr w:type="spellEnd"/>
+      <w:r>
+        <w:rPr>
+          <w:b/>
+          <w:bCs/>
+          <w:sz w:val="24"/>
+          <w:szCs w:val="24"/>
+        </w:rPr>
+        <w:t xml:space="preserve"> ↔ </w:t>
+      </w:r>
+      <w:proofErr w:type="spellStart"/>
+      <w:r>
+        <w:rPr>
+          <w:b/>
+          <w:bCs/>
+          <w:sz w:val="24"/>
+          <w:szCs w:val="24"/>
+        </w:rPr>
+        <w:t>HotelStatusHistory</w:t>
+      </w:r>
+      <w:proofErr w:type="spellEnd"/>
+      <w:r>
+        <w:rPr>
+          <w:b/>
+          <w:bCs/>
+          <w:sz w:val="24"/>
+          <w:szCs w:val="24"/>
+        </w:rPr>
+        <w:t>:</w:t>
       </w:r>
       <w:r>
         <w:rPr>

</xml_diff>